<commit_message>
fix(regulations): wording of the legal status notice and the closing quote after ZOZ
Both corrections requested by the organiser; the PDF is rebuilt from the corrected .docx.

Co-Authored-By: Claude Fable 5.1 <noreply@anthropic.com>
</commit_message>
<xml_diff>
--- a/backend/apps/cms/fixtures/regulamin/Regulamin-Olimpiady-Kwantowej.docx
+++ b/backend/apps/cms/fixtures/regulamin/Regulamin-Olimpiady-Kwantowej.docx
@@ -698,7 +698,7 @@
                 <w:szCs w:val="20"/>
                 <w:rtl w:val="0"/>
               </w:rPr>
-              <w:t xml:space="preserve">Olimpiada Kwantowa w opisanym niżej modelu trzech etapów jest niezależnym konkursem edukacyjnym. Nie jest olimpiadą trójstopniową przeprowadzaną na podstawie rozporządzenia ministra właściwego ds edukacji i nie nadaje ustawowych uprawnień laureata lub finalisty, dopóki nie zostanie formalnie objęta właściwym trybem prawnym, a jej regulamin nie zostanie odpowiednio dostosowany.</w:t>
+              <w:t xml:space="preserve">Olimpiada Kwantowa w opisanym niżej modelu trzech etapów jest niezależnym konkursem edukacyjnym. Nie jest olimpiadą trójstopniową przeprowadzaną na podstawie rozporządzenia Ministra właściwego ds. Edukacji i nie nadaje ustawowych uprawnień laureata lub finalisty, dopóki nie zostanie formalnie objęta właściwym trybem prawnym, a jej regulamin nie zostanie odpowiednio dostosowany.</w:t>
             </w:r>
             <w:r>
               <w:rPr>
@@ -1649,7 +1649,7 @@
           <w:vertAlign w:val="baseline"/>
           <w:rtl w:val="0"/>
         </w:rPr>
-        <w:t xml:space="preserve">, zwane dalej „ZOZ</w:t>
+        <w:t xml:space="preserve">, zwane dalej „ZOZ”</w:t>
       </w:r>
       <w:r>
         <w:rPr>

</xml_diff>